<commit_message>
feat: migrate backend to Supabase PostgreSQL
</commit_message>
<xml_diff>
--- a/docs/Mundo_Nomada_Documentacion_Actualizada.docx
+++ b/docs/Mundo_Nomada_Documentacion_Actualizada.docx
@@ -119,7 +119,7 @@
         <w:spacing w:after="60"/>
       </w:pPr>
       <w:r>
-        <w:t>Destino de produccion: Supabase PostgreSQL, con migraciones SQL versionadas en la carpeta supabase del repositorio.</w:t>
+        <w:t>Destino de produccion: el proyecto Supabase PostgreSQL mundo-nomada ya existe en West EU Ireland. La migracion inicial versionada se aplico y las tablas de negocio tienen RLS activado.</w:t>
       </w:r>
     </w:p>
     <w:p>
@@ -128,7 +128,7 @@
         <w:spacing w:after="60"/>
       </w:pPr>
       <w:r>
-        <w:t>Archivos privados: la conexion se define por variables de entorno o por config database local php, que Git ignora.</w:t>
+        <w:t>Archivos privados: la conexion se define por variables de entorno o por archivos locales que Git ignora. Para Supabase, PHP necesita la extension PDO PostgreSQL activada.</w:t>
       </w:r>
     </w:p>
     <w:p>
@@ -754,7 +754,55 @@
         <w:spacing w:after="120" w:line="276" w:lineRule="auto"/>
       </w:pPr>
       <w:r>
-        <w:t>Para Supabase, las migraciones se aplicaran desde los archivos versionados. No se editaran tablas manualmente en el panel remoto cuando el flujo de migraciones este activo, porque se perderia la trazabilidad de los cambios.</w:t>
+        <w:t>Para Supabase, la migracion inicial ya se aplico desde el archivo versionado. Antes de usar la CLI para cambios futuros, se debe registrar esa migracion como aplicada, y despues cada cambio se aplicara desde un nuevo archivo versionado. No se editaran tablas manualmente en el panel remoto porque se perderia la trazabilidad de los cambios.</w:t>
+      </w:r>
+    </w:p>
+    <w:p>
+      <w:pPr>
+        <w:pStyle w:val="Heading1"/>
+        <w:spacing w:before="280" w:after="120"/>
+      </w:pPr>
+      <w:r>
+        <w:rPr>
+          <w:color w:val="000000"/>
+        </w:rPr>
+        <w:t>Guia manual de conexion a Supabase</w:t>
+      </w:r>
+    </w:p>
+    <w:p>
+      <w:pPr>
+        <w:pStyle w:val="ListBullet"/>
+        <w:spacing w:after="60"/>
+      </w:pPr>
+      <w:r>
+        <w:t>En Project Settings y Database, restablece la contrasena de PostgreSQL y guardala en un gestor de contrasenas. No la compartas por chat ni la subas a Git.</w:t>
+      </w:r>
+    </w:p>
+    <w:p>
+      <w:pPr>
+        <w:pStyle w:val="ListBullet"/>
+        <w:spacing w:after="60"/>
+      </w:pPr>
+      <w:r>
+        <w:t>En Connect, usa Session pooler. Copia sus datos en config supabase local php dentro del backend a partir del ejemplo y completa la contrasena. Ese archivo esta ignorado por Git.</w:t>
+      </w:r>
+    </w:p>
+    <w:p>
+      <w:pPr>
+        <w:pStyle w:val="ListBullet"/>
+        <w:spacing w:after="60"/>
+      </w:pPr>
+      <w:r>
+        <w:t>En C XAMPP php php ini, habilita pdo pgsql y pgsql, y reinicia Apache. Sin esos drivers PHP no puede conectarse a PostgreSQL.</w:t>
+      </w:r>
+    </w:p>
+    <w:p>
+      <w:pPr>
+        <w:pStyle w:val="ListBullet"/>
+        <w:spacing w:after="60"/>
+      </w:pPr>
+      <w:r>
+        <w:t>Crea un token personal de Supabase en tu cuenta y ejecuta la reparacion del historial indicada en supabase README antes de usar db push. No compartas el token.</w:t>
       </w:r>
     </w:p>
     <w:p>
@@ -782,7 +830,7 @@
         <w:pStyle w:val="ListNumber"/>
       </w:pPr>
       <w:r>
-        <w:t>Crear el proyecto Supabase, aplicar la migracion inicial y adaptar la conexion PHP de mysqli a PDO PostgreSQL.</w:t>
+        <w:t>Configurar la contrasena y los drivers PDO PostgreSQL, y adaptar la conexion PHP de mysqli a PDO PostgreSQL.</w:t>
       </w:r>
     </w:p>
     <w:p>

</xml_diff>